<commit_message>
paper: acknowledgments — NASEM Gulf Research Program and NSF funding, AI language-polishing disclosure
Co-Authored-By: Claude Fable 5.1 <noreply@anthropic.com>
</commit_message>
<xml_diff>
--- a/paper/ray-resilience-oasis2026-draft.docx
+++ b/paper/ray-resilience-oasis2026-draft.docx
@@ -4359,13 +4359,61 @@
         <w:pStyle w:val="FirstParagraph"/>
       </w:pPr>
       <w:r>
-        <w:t xml:space="preserve">RAY is an MIT-licensed research prototype. It is not an official</w:t>
-      </w:r>
-      <w:r>
-        <w:t xml:space="preserve"> </w:t>
-      </w:r>
-      <w:r>
-        <w:t xml:space="preserve">forecasting or warning service.</w:t>
+        <w:t xml:space="preserve">RAY is an MIT-licensed research prototype; it is not an official</w:t>
+      </w:r>
+      <w:r>
+        <w:t xml:space="preserve"> </w:t>
+      </w:r>
+      <w:r>
+        <w:t xml:space="preserve">forecasting or warning service. This research is based on work supported</w:t>
+      </w:r>
+      <w:r>
+        <w:t xml:space="preserve"> </w:t>
+      </w:r>
+      <w:r>
+        <w:t xml:space="preserve">by the National Academies of Sciences, Engineering, and Medicine (NASEM)</w:t>
+      </w:r>
+      <w:r>
+        <w:t xml:space="preserve"> </w:t>
+      </w:r>
+      <w:r>
+        <w:t xml:space="preserve">under the Gulf Research Program (Award Nos. SCON-10000653 and</w:t>
+      </w:r>
+      <w:r>
+        <w:t xml:space="preserve"> </w:t>
+      </w:r>
+      <w:r>
+        <w:t xml:space="preserve">SCON-10001536) and by the U.S. National Science Foundation (Award</w:t>
+      </w:r>
+      <w:r>
+        <w:t xml:space="preserve"> </w:t>
+      </w:r>
+      <w:r>
+        <w:t xml:space="preserve">No. 2318206). Any opinions, findings, and conclusions expressed here are</w:t>
+      </w:r>
+      <w:r>
+        <w:t xml:space="preserve"> </w:t>
+      </w:r>
+      <w:r>
+        <w:t xml:space="preserve">those of the authors and do not necessarily reflect the views of the</w:t>
+      </w:r>
+      <w:r>
+        <w:t xml:space="preserve"> </w:t>
+      </w:r>
+      <w:r>
+        <w:t xml:space="preserve">funders. The authors used Claude (Anthropic) to polish the language of</w:t>
+      </w:r>
+      <w:r>
+        <w:t xml:space="preserve"> </w:t>
+      </w:r>
+      <w:r>
+        <w:t xml:space="preserve">this manuscript; the system, analyses, and claims were designed, written,</w:t>
+      </w:r>
+      <w:r>
+        <w:t xml:space="preserve"> </w:t>
+      </w:r>
+      <w:r>
+        <w:t xml:space="preserve">and verified by the authors, who take full responsibility for the content.</w:t>
       </w:r>
     </w:p>
     <w:bookmarkEnd w:id="39"/>

</xml_diff>